<commit_message>
Agrega las "/" automáticamente al escribir las fechas
Los campos de fecha del servicio y fecha del informe aceptan solo números y
ponen las barras solas (DD/MM/AAAA). La fecha del servicio pasa a escribirse
con "/" y la leída por la IA también se muestra así.

Co-Authored-By: Claude Opus 5.5 <noreply@anthropic.com>
</commit_message>
<xml_diff>
--- a/Instructivo de uso - Informes App.docx
+++ b/Instructivo de uso - Informes App.docx
@@ -30,7 +30,42 @@
     </w:p>
     <w:p>
       <w:r>
-        <w:t>El informe generado tiene 7 páginas: portada, índice, 1 Objetivo, 2 Antecedentes del equipo, 3 Evaluación técnica, 4 Registro de baterías, 5 Registro fotográfico y 6 Registro de hoja de trabajo. El técnico solo revisa los datos, sube las fotos y confirma la vista previa antes de descargar.</w:t>
+        <w:t>El informe generado tiene 7 páginas: portada, índice,</w:t>
+      </w:r>
+    </w:p>
+    <w:p>
+      <w:r>
+        <w:t xml:space="preserve"> 1 Objetivo,</w:t>
+      </w:r>
+    </w:p>
+    <w:p>
+      <w:r>
+        <w:t xml:space="preserve"> 2 Antecedentes del equipo,</w:t>
+      </w:r>
+    </w:p>
+    <w:p>
+      <w:r>
+        <w:t xml:space="preserve"> 3 Evaluación técnica,</w:t>
+      </w:r>
+    </w:p>
+    <w:p>
+      <w:r>
+        <w:t xml:space="preserve"> 4 Registro de baterías, </w:t>
+      </w:r>
+    </w:p>
+    <w:p>
+      <w:r>
+        <w:t xml:space="preserve">5 Registro fotográfico y </w:t>
+      </w:r>
+    </w:p>
+    <w:p>
+      <w:r>
+        <w:t xml:space="preserve">6 Registro de hoja de trabajo. </w:t>
+      </w:r>
+    </w:p>
+    <w:p>
+      <w:r>
+        <w:t>El técnico solo revisa los datos, sube las fotos y confirma la vista previa antes de descargar.</w:t>
       </w:r>
     </w:p>
     <w:p>
@@ -256,14 +291,12 @@
             <w:r>
               <w:t xml:space="preserve">Usuario </w:t>
             </w:r>
-            <w:proofErr w:type="spellStart"/>
             <w:r>
               <w:rPr>
                 <w:rStyle w:val="CodeChar"/>
               </w:rPr>
               <w:t>ffica</w:t>
             </w:r>
-            <w:proofErr w:type="spellEnd"/>
             <w:r>
               <w:t xml:space="preserve"> y la contraseña del equipo</w:t>
             </w:r>
@@ -274,19 +307,15 @@
     <w:p/>
     <w:p>
       <w:r>
-        <w:t>En el plan gratuito de Render, la primera visita después de un rato sin uso puede tardar cerca de 1 minuto en cargar.</w:t>
+        <w:t>En el plan gratuito de Render, la primera visita después de un rato sin uso puede tardar cerca de 1 minuto en cargar</w:t>
       </w:r>
     </w:p>
     <w:p/>
-    <w:p/>
-    <w:p/>
-    <w:p/>
     <w:p>
       <w:pPr>
         <w:pStyle w:val="Ttulo2"/>
       </w:pPr>
       <w:r>
-        <w:lastRenderedPageBreak/>
         <w:t>Paso a paso</w:t>
       </w:r>
     </w:p>
@@ -325,6 +354,11 @@
     <w:p>
       <w:pPr>
         <w:pStyle w:val="Prrafodelista"/>
+      </w:pPr>
+    </w:p>
+    <w:p>
+      <w:pPr>
+        <w:pStyle w:val="Prrafodelista"/>
         <w:numPr>
           <w:ilvl w:val="0"/>
           <w:numId w:val="3"/>
@@ -415,6 +449,12 @@
     <w:p>
       <w:pPr>
         <w:pStyle w:val="Prrafodelista"/>
+        <w:ind w:left="1440"/>
+      </w:pPr>
+    </w:p>
+    <w:p>
+      <w:pPr>
+        <w:pStyle w:val="Prrafodelista"/>
         <w:numPr>
           <w:ilvl w:val="0"/>
           <w:numId w:val="3"/>
@@ -505,6 +545,12 @@
     <w:p>
       <w:pPr>
         <w:pStyle w:val="Prrafodelista"/>
+        <w:ind w:left="1440"/>
+      </w:pPr>
+    </w:p>
+    <w:p>
+      <w:pPr>
+        <w:pStyle w:val="Prrafodelista"/>
         <w:numPr>
           <w:ilvl w:val="0"/>
           <w:numId w:val="3"/>
@@ -523,6 +569,11 @@
     <w:p>
       <w:pPr>
         <w:pStyle w:val="Prrafodelista"/>
+      </w:pPr>
+    </w:p>
+    <w:p>
+      <w:pPr>
+        <w:pStyle w:val="Prrafodelista"/>
         <w:numPr>
           <w:ilvl w:val="0"/>
           <w:numId w:val="3"/>
@@ -664,12 +715,9 @@
         <w:t>Descargar informe</w:t>
       </w:r>
       <w:r>
-        <w:t>. Con «Ambos» el navegador puede pedir permiso para descargar 2 archivos: acéptalo.</w:t>
-      </w:r>
-    </w:p>
-    <w:p/>
-    <w:p/>
-    <w:p/>
+        <w:t>. Con «Ambos» el navegador puede pedir permiso para descargar 2 archivos: acéptalo</w:t>
+      </w:r>
+    </w:p>
     <w:p/>
     <w:p/>
     <w:p>
@@ -774,13 +822,8 @@
             <w:tcW w:w="4680" w:type="dxa"/>
           </w:tcPr>
           <w:p>
-            <w:proofErr w:type="spellStart"/>
-            <w:r>
-              <w:t>N°</w:t>
-            </w:r>
-            <w:proofErr w:type="spellEnd"/>
-            <w:r>
-              <w:t xml:space="preserve"> de informe</w:t>
+            <w:r>
+              <w:t>N° de informe</w:t>
             </w:r>
           </w:p>
         </w:tc>
@@ -889,13 +932,8 @@
             <w:tcW w:w="4680" w:type="dxa"/>
           </w:tcPr>
           <w:p>
-            <w:proofErr w:type="spellStart"/>
-            <w:r>
-              <w:t>N°</w:t>
-            </w:r>
-            <w:proofErr w:type="spellEnd"/>
-            <w:r>
-              <w:t xml:space="preserve"> del módulo</w:t>
+            <w:r>
+              <w:t>N° del módulo</w:t>
             </w:r>
           </w:p>
         </w:tc>
@@ -993,15 +1031,7 @@
           </w:tcPr>
           <w:p>
             <w:r>
-              <w:t xml:space="preserve">Sistema UPS, Administración; resistencias 17.0 / 22.8 / 24.7 </w:t>
-            </w:r>
-            <w:proofErr w:type="spellStart"/>
-            <w:r>
-              <w:t>mΩ</w:t>
-            </w:r>
-            <w:proofErr w:type="spellEnd"/>
-            <w:r>
-              <w:t>; Warning 0, Fail 0</w:t>
+              <w:t>Sistema UPS, Administración; resistencias 17.0 / 22.8 / 24.7 mΩ; Warning 0, Fail 0</w:t>
             </w:r>
           </w:p>
         </w:tc>
@@ -1230,7 +1260,15 @@
             <w:tcW w:w="4680" w:type="dxa"/>
           </w:tcPr>
           <w:p>
-            <w:r>
+            <w:pPr>
+              <w:rPr>
+                <w:lang w:val="en-US"/>
+              </w:rPr>
+            </w:pPr>
+            <w:r>
+              <w:rPr>
+                <w:lang w:val="en-US"/>
+              </w:rPr>
               <w:t>HRL12110, HRL12120, HRL12150, HRL12200, HRL12280, SWL1100</w:t>
             </w:r>
           </w:p>
@@ -1420,14 +1458,12 @@
             <w:r>
               <w:t xml:space="preserve">Usuario </w:t>
             </w:r>
-            <w:proofErr w:type="spellStart"/>
             <w:r>
               <w:rPr>
                 <w:rStyle w:val="CodeChar"/>
               </w:rPr>
               <w:t>ffica</w:t>
             </w:r>
-            <w:proofErr w:type="spellEnd"/>
             <w:r>
               <w:t xml:space="preserve"> y la contraseña </w:t>
             </w:r>

</xml_diff>